<commit_message>
Use full-width borders for both control-design answer lines
</commit_message>
<xml_diff>
--- a/paperwork/generated/WS1_student.docx
+++ b/paperwork/generated/WS1_student.docx
@@ -858,24 +858,30 @@
     </w:p>
     <w:p>
       <w:pPr>
-        <w:spacing w:line="520" w:lineRule="exact"/>
+        <w:spacing w:line="520" w:lineRule="exact" w:after="0"/>
+        <w:pBdr>
+          <w:bottom w:val="single" w:color="333333" w:sz="8"/>
+          <w:between w:val="single" w:color="333333" w:sz="8"/>
+        </w:pBdr>
       </w:pPr>
       <w:r>
         <w:rPr>
           <w:sz w:val="24"/>
         </w:rPr>
-        <w:t>________________________________________________________________</w:t>
       </w:r>
     </w:p>
     <w:p>
       <w:pPr>
-        <w:spacing w:line="520" w:lineRule="exact"/>
+        <w:spacing w:line="520" w:lineRule="exact" w:after="0"/>
+        <w:pBdr>
+          <w:bottom w:val="single" w:color="333333" w:sz="8"/>
+          <w:between w:val="single" w:color="333333" w:sz="8"/>
+        </w:pBdr>
       </w:pPr>
       <w:r>
         <w:rPr>
           <w:sz w:val="24"/>
         </w:rPr>
-        <w:t>________________________________________________________________</w:t>
       </w:r>
     </w:p>
     <w:p>

</xml_diff>